<commit_message>
added more docker services + fixed 2fa and a couple other issues
</commit_message>
<xml_diff>
--- a/docs/thesis/thesis_plan.docx
+++ b/docs/thesis/thesis_plan.docx
@@ -350,6 +350,13 @@
         </w:rPr>
         <w:t>Anonim tárolás</w:t>
       </w:r>
+      <w:r>
+        <w:rPr>
+          <w:sz w:val="22"/>
+          <w:szCs w:val="22"/>
+        </w:rPr>
+        <w:t xml:space="preserve"> - kesz</w:t>
+      </w:r>
     </w:p>
     <w:p>
       <w:pPr>
@@ -370,6 +377,13 @@
         </w:rPr>
         <w:t>Csoportok</w:t>
       </w:r>
+      <w:r>
+        <w:rPr>
+          <w:sz w:val="22"/>
+          <w:szCs w:val="22"/>
+        </w:rPr>
+        <w:t xml:space="preserve"> - kesz</w:t>
+      </w:r>
     </w:p>
     <w:p>
       <w:pPr>
@@ -409,6 +423,13 @@
           <w:szCs w:val="22"/>
         </w:rPr>
         <w:t>Tervezés</w:t>
+      </w:r>
+      <w:r>
+        <w:rPr>
+          <w:sz w:val="22"/>
+          <w:szCs w:val="22"/>
+        </w:rPr>
+        <w:t xml:space="preserve"> - kesz</w:t>
       </w:r>
     </w:p>
     <w:p>

</xml_diff>